<commit_message>
Muchos cambios y limpieza
Añadidos temas de RandomForest y modelos de forecast
Nueva hoja agenda en estorninos
arreglo de mostrar factura en yesterday
muestra regresiones de yesterday
</commit_message>
<xml_diff>
--- a/utilities/Precio tarifa indexada.docx
+++ b/utilities/Precio tarifa indexada.docx
@@ -3,6 +3,16 @@
 <w:document xmlns:wpc="http://schemas.microsoft.com/office/word/2010/wordprocessingCanvas" xmlns:cx="http://schemas.microsoft.com/office/drawing/2014/chartex" xmlns:cx1="http://schemas.microsoft.com/office/drawing/2015/9/8/chartex" xmlns:cx2="http://schemas.microsoft.com/office/drawing/2015/10/21/chartex" xmlns:cx3="http://schemas.microsoft.com/office/drawing/2016/5/9/chartex" xmlns:cx4="http://schemas.microsoft.com/office/drawing/2016/5/10/chartex" xmlns:cx5="http://schemas.microsoft.com/office/drawing/2016/5/11/chartex" xmlns:cx6="http://schemas.microsoft.com/office/drawing/2016/5/12/chartex" xmlns:cx7="http://schemas.microsoft.com/office/drawing/2016/5/13/chartex" xmlns:cx8="http://schemas.microsoft.com/office/drawing/2016/5/14/chartex" xmlns:mc="http://schemas.openxmlformats.org/markup-compatibility/2006" xmlns:aink="http://schemas.microsoft.com/office/drawing/2016/ink" xmlns:am3d="http://schemas.microsoft.com/office/drawing/2017/model3d" xmlns:o="urn:schemas-microsoft-com:office:office" xmlns:oel="http://schemas.microsoft.com/office/2019/extlst" xmlns:r="http://schemas.openxmlformats.org/officeDocument/2006/relationships" xmlns:m="http://schemas.openxmlformats.org/officeDocument/2006/math" xmlns:v="urn:schemas-microsoft-com:vml" xmlns:wp14="http://schemas.microsoft.com/office/word/2010/wordprocessingDrawing" xmlns:wp="http://schemas.openxmlformats.org/drawingml/2006/wordprocessingDrawing" xmlns:w10="urn:schemas-microsoft-com:office:word" xmlns:w="http://schemas.openxmlformats.org/wordprocessingml/2006/main" xmlns:w14="http://schemas.microsoft.com/office/word/2010/wordml" xmlns:w15="http://schemas.microsoft.com/office/word/2012/wordml" xmlns:w16cex="http://schemas.microsoft.com/office/word/2018/wordml/cex" xmlns:w16cid="http://schemas.microsoft.com/office/word/2016/wordml/cid" xmlns:w16="http://schemas.microsoft.com/office/word/2018/wordml" xmlns:w16du="http://schemas.microsoft.com/office/word/2023/wordml/word16du" xmlns:w16sdtdh="http://schemas.microsoft.com/office/word/2020/wordml/sdtdatahash" xmlns:w16sdtfl="http://schemas.microsoft.com/office/word/2024/wordml/sdtformatlock" xmlns:w16se="http://schemas.microsoft.com/office/word/2015/wordml/symex" xmlns:wpg="http://schemas.microsoft.com/office/word/2010/wordprocessingGroup" xmlns:wpi="http://schemas.microsoft.com/office/word/2010/wordprocessingInk" xmlns:wne="http://schemas.microsoft.com/office/word/2006/wordml" xmlns:wps="http://schemas.microsoft.com/office/word/2010/wordprocessingShape" mc:Ignorable="w14 w15 w16se w16cid w16 w16cex w16sdtdh w16sdtfl w16du wp14">
   <w:body>
     <w:p>
+      <w:hyperlink r:id="rId5" w:history="1">
+        <w:r>
+          <w:rPr>
+            <w:rStyle w:val="Hipervnculo"/>
+          </w:rPr>
+          <w:t>Cómo calculamos el precio</w:t>
+        </w:r>
+      </w:hyperlink>
+    </w:p>
+    <w:p>
       <w:r>
         <w:t xml:space="preserve">Siendo </w:t>
       </w:r>
@@ -521,10 +531,44 @@
           <w:b/>
           <w:bCs/>
         </w:rPr>
+        <w:lastRenderedPageBreak/>
         <w:t>CA</w:t>
       </w:r>
       <w:r>
         <w:t> = Coste regulado de los cargos del sistema eléctrico definidos por el Ministerio correspondiente, aplicado sobre el total de la energía consumida.</w:t>
+      </w:r>
+    </w:p>
+    <w:p/>
+    <w:p>
+      <w:pPr>
+        <w:rPr>
+          <w:b/>
+          <w:bCs/>
+        </w:rPr>
+      </w:pPr>
+      <w:r>
+        <w:rPr>
+          <w:b/>
+          <w:bCs/>
+        </w:rPr>
+        <w:t>Compensación de excedentes con la Tarifa Indexada</w:t>
+      </w:r>
+    </w:p>
+    <w:p>
+      <w:r>
+        <w:t>Compensamos los excedentes al precio de la electricidad mayorista, sin sumar ni restar costes adicionales como peajes y cargos.</w:t>
+      </w:r>
+      <w:r>
+        <w:br/>
+        <w:t>El precio varía cada hora. Suele ser más económico durante las horas de sol y más elevado cuando la demanda aumenta en ausencia de luz.</w:t>
+      </w:r>
+      <w:r>
+        <w:br/>
+        <w:t>A la hora de elegir la tarifa más beneficiosa para ti, es importante que analices si la cantidad de excedentes que tienes es muy significativa y en qué horarios te sobra mayor cantidad de electricidad. En las instalaciones fotovoltaicas, suele haber más energía sobrante en las horas de mayor producción.</w:t>
+      </w:r>
+      <w:r>
+        <w:br/>
+        <w:t>Y es ahí cuando los precios de compensación suelen ser más bajos, mientras que en las horas en que se incrementa el consumo de electricidad no hay producción renovable. Por eso los precios a los que se paga la electricidad suelen ser mayores en esos horarios, así que:</w:t>
       </w:r>
     </w:p>
     <w:p/>
@@ -1611,6 +1655,29 @@
       <w:spacing w:val="5"/>
     </w:rPr>
   </w:style>
+  <w:style w:type="character" w:styleId="Hipervnculo">
+    <w:name w:val="Hyperlink"/>
+    <w:basedOn w:val="Fuentedeprrafopredeter"/>
+    <w:uiPriority w:val="99"/>
+    <w:unhideWhenUsed/>
+    <w:rsid w:val="00490DAB"/>
+    <w:rPr>
+      <w:color w:val="0563C1" w:themeColor="hyperlink"/>
+      <w:u w:val="single"/>
+    </w:rPr>
+  </w:style>
+  <w:style w:type="character" w:styleId="Mencinsinresolver">
+    <w:name w:val="Unresolved Mention"/>
+    <w:basedOn w:val="Fuentedeprrafopredeter"/>
+    <w:uiPriority w:val="99"/>
+    <w:semiHidden/>
+    <w:unhideWhenUsed/>
+    <w:rsid w:val="00490DAB"/>
+    <w:rPr>
+      <w:color w:val="605E5C"/>
+      <w:shd w:val="clear" w:color="auto" w:fill="E1DFDD"/>
+    </w:rPr>
+  </w:style>
 </w:styles>
 </file>
 

</xml_diff>